<commit_message>
Mise a jour des priorités
</commit_message>
<xml_diff>
--- a/Documentation sur les priorites/Priorite.docx
+++ b/Documentation sur les priorites/Priorite.docx
@@ -61,6 +61,42 @@
       <w:r>
         <w:t>Hémorragie</w:t>
       </w:r>
+      <w:r>
+        <w:t xml:space="preserve"> avec choc immédiat</w:t>
+      </w:r>
+    </w:p>
+    <w:p>
+      <w:pPr>
+        <w:pStyle w:val="Paragraphedeliste"/>
+        <w:numPr>
+          <w:ilvl w:val="2"/>
+          <w:numId w:val="1"/>
+        </w:numPr>
+      </w:pPr>
+      <w:r>
+        <w:t xml:space="preserve">Saignement important </w:t>
+      </w:r>
+      <w:r>
+        <w:t>et non contenu</w:t>
+      </w:r>
+    </w:p>
+    <w:p>
+      <w:pPr>
+        <w:pStyle w:val="Paragraphedeliste"/>
+        <w:numPr>
+          <w:ilvl w:val="2"/>
+          <w:numId w:val="1"/>
+        </w:numPr>
+      </w:pPr>
+      <w:r>
+        <w:t>Signes vitaux</w:t>
+      </w:r>
+      <w:r>
+        <w:t xml:space="preserve"> </w:t>
+      </w:r>
+      <w:r>
+        <w:t>pas stable</w:t>
+      </w:r>
     </w:p>
     <w:p>
       <w:pPr>
@@ -195,6 +231,72 @@
       <w:pPr>
         <w:pStyle w:val="Paragraphedeliste"/>
         <w:numPr>
+          <w:ilvl w:val="1"/>
+          <w:numId w:val="1"/>
+        </w:numPr>
+      </w:pPr>
+      <w:r>
+        <w:t>Trauma</w:t>
+      </w:r>
+    </w:p>
+    <w:p>
+      <w:pPr>
+        <w:pStyle w:val="Paragraphedeliste"/>
+        <w:numPr>
+          <w:ilvl w:val="1"/>
+          <w:numId w:val="1"/>
+        </w:numPr>
+      </w:pPr>
+      <w:r>
+        <w:t>Sep</w:t>
+      </w:r>
+      <w:r>
+        <w:t>si</w:t>
+      </w:r>
+      <w:r>
+        <w:t>s</w:t>
+      </w:r>
+    </w:p>
+    <w:p>
+      <w:pPr>
+        <w:pStyle w:val="Paragraphedeliste"/>
+        <w:numPr>
+          <w:ilvl w:val="2"/>
+          <w:numId w:val="1"/>
+        </w:numPr>
+      </w:pPr>
+      <w:r>
+        <w:t>Fièvre</w:t>
+      </w:r>
+    </w:p>
+    <w:p>
+      <w:pPr>
+        <w:pStyle w:val="Paragraphedeliste"/>
+        <w:numPr>
+          <w:ilvl w:val="2"/>
+          <w:numId w:val="1"/>
+        </w:numPr>
+      </w:pPr>
+      <w:r>
+        <w:t xml:space="preserve"> Fréquence cardiaque élevée</w:t>
+      </w:r>
+    </w:p>
+    <w:p>
+      <w:pPr>
+        <w:pStyle w:val="Paragraphedeliste"/>
+        <w:numPr>
+          <w:ilvl w:val="2"/>
+          <w:numId w:val="1"/>
+        </w:numPr>
+      </w:pPr>
+      <w:r>
+        <w:t xml:space="preserve"> Malaise général</w:t>
+      </w:r>
+    </w:p>
+    <w:p>
+      <w:pPr>
+        <w:pStyle w:val="Paragraphedeliste"/>
+        <w:numPr>
           <w:ilvl w:val="0"/>
           <w:numId w:val="1"/>
         </w:numPr>
@@ -285,6 +387,334 @@
       <w:pPr>
         <w:pStyle w:val="Paragraphedeliste"/>
         <w:numPr>
+          <w:ilvl w:val="1"/>
+          <w:numId w:val="1"/>
+        </w:numPr>
+      </w:pPr>
+      <w:r>
+        <w:t>Choc anaphylactique</w:t>
+      </w:r>
+    </w:p>
+    <w:p>
+      <w:pPr>
+        <w:pStyle w:val="Paragraphedeliste"/>
+        <w:numPr>
+          <w:ilvl w:val="2"/>
+          <w:numId w:val="1"/>
+        </w:numPr>
+      </w:pPr>
+      <w:r>
+        <w:t xml:space="preserve">Gonflement visage/gorge, difficulté à </w:t>
+      </w:r>
+      <w:r>
+        <w:t>respirer,</w:t>
+      </w:r>
+      <w:r>
+        <w:t xml:space="preserve"> chute de pression</w:t>
+      </w:r>
+    </w:p>
+    <w:p>
+      <w:pPr>
+        <w:pStyle w:val="Paragraphedeliste"/>
+        <w:numPr>
+          <w:ilvl w:val="1"/>
+          <w:numId w:val="1"/>
+        </w:numPr>
+      </w:pPr>
+      <w:r>
+        <w:t xml:space="preserve">Hémorragie sans choc </w:t>
+      </w:r>
+      <w:r>
+        <w:t xml:space="preserve">immédiat </w:t>
+      </w:r>
+    </w:p>
+    <w:p>
+      <w:pPr>
+        <w:pStyle w:val="Paragraphedeliste"/>
+        <w:numPr>
+          <w:ilvl w:val="2"/>
+          <w:numId w:val="1"/>
+        </w:numPr>
+      </w:pPr>
+      <w:r>
+        <w:t>Saignement important mais contenu</w:t>
+      </w:r>
+    </w:p>
+    <w:p>
+      <w:pPr>
+        <w:pStyle w:val="Paragraphedeliste"/>
+        <w:numPr>
+          <w:ilvl w:val="2"/>
+          <w:numId w:val="1"/>
+        </w:numPr>
+      </w:pPr>
+      <w:r>
+        <w:t>Signe vitaux stable</w:t>
+      </w:r>
+    </w:p>
+    <w:p>
+      <w:pPr>
+        <w:pStyle w:val="Paragraphedeliste"/>
+        <w:numPr>
+          <w:ilvl w:val="1"/>
+          <w:numId w:val="1"/>
+        </w:numPr>
+      </w:pPr>
+      <w:r>
+        <w:t>Crise d’asthme sévère</w:t>
+      </w:r>
+    </w:p>
+    <w:p>
+      <w:pPr>
+        <w:pStyle w:val="Paragraphedeliste"/>
+        <w:numPr>
+          <w:ilvl w:val="2"/>
+          <w:numId w:val="1"/>
+        </w:numPr>
+      </w:pPr>
+      <w:r>
+        <w:t xml:space="preserve">Sifflement </w:t>
+      </w:r>
+    </w:p>
+    <w:p>
+      <w:pPr>
+        <w:pStyle w:val="Paragraphedeliste"/>
+        <w:numPr>
+          <w:ilvl w:val="2"/>
+          <w:numId w:val="1"/>
+        </w:numPr>
+      </w:pPr>
+      <w:r>
+        <w:lastRenderedPageBreak/>
+        <w:t xml:space="preserve">Difficulté </w:t>
+      </w:r>
+      <w:r>
+        <w:t xml:space="preserve">à parler </w:t>
+      </w:r>
+    </w:p>
+    <w:p>
+      <w:pPr>
+        <w:pStyle w:val="Paragraphedeliste"/>
+        <w:numPr>
+          <w:ilvl w:val="2"/>
+          <w:numId w:val="1"/>
+        </w:numPr>
+      </w:pPr>
+      <w:r>
+        <w:t>Oppression thoracique</w:t>
+      </w:r>
+    </w:p>
+    <w:p>
+      <w:pPr>
+        <w:pStyle w:val="Paragraphedeliste"/>
+        <w:numPr>
+          <w:ilvl w:val="1"/>
+          <w:numId w:val="1"/>
+        </w:numPr>
+      </w:pPr>
+      <w:r>
+        <w:t>Traumatisme crânien avec vigilance altérée</w:t>
+      </w:r>
+    </w:p>
+    <w:p>
+      <w:pPr>
+        <w:pStyle w:val="Paragraphedeliste"/>
+        <w:numPr>
+          <w:ilvl w:val="2"/>
+          <w:numId w:val="1"/>
+        </w:numPr>
+      </w:pPr>
+      <w:r>
+        <w:t>Confusion</w:t>
+      </w:r>
+    </w:p>
+    <w:p>
+      <w:pPr>
+        <w:pStyle w:val="Paragraphedeliste"/>
+        <w:numPr>
+          <w:ilvl w:val="2"/>
+          <w:numId w:val="1"/>
+        </w:numPr>
+      </w:pPr>
+      <w:r>
+        <w:t xml:space="preserve"> Somnolence</w:t>
+      </w:r>
+    </w:p>
+    <w:p>
+      <w:pPr>
+        <w:pStyle w:val="Paragraphedeliste"/>
+        <w:numPr>
+          <w:ilvl w:val="2"/>
+          <w:numId w:val="1"/>
+        </w:numPr>
+      </w:pPr>
+      <w:r>
+        <w:t xml:space="preserve"> </w:t>
+      </w:r>
+      <w:r>
+        <w:t>V</w:t>
+      </w:r>
+      <w:r>
+        <w:t>omissements</w:t>
+      </w:r>
+    </w:p>
+    <w:p>
+      <w:pPr>
+        <w:pStyle w:val="Paragraphedeliste"/>
+        <w:numPr>
+          <w:ilvl w:val="1"/>
+          <w:numId w:val="1"/>
+        </w:numPr>
+      </w:pPr>
+      <w:r>
+        <w:t>Hypoglycémie sévère</w:t>
+      </w:r>
+    </w:p>
+    <w:p>
+      <w:pPr>
+        <w:pStyle w:val="Paragraphedeliste"/>
+        <w:numPr>
+          <w:ilvl w:val="2"/>
+          <w:numId w:val="1"/>
+        </w:numPr>
+      </w:pPr>
+      <w:r>
+        <w:t>Tremblements</w:t>
+      </w:r>
+    </w:p>
+    <w:p>
+      <w:pPr>
+        <w:pStyle w:val="Paragraphedeliste"/>
+        <w:numPr>
+          <w:ilvl w:val="2"/>
+          <w:numId w:val="1"/>
+        </w:numPr>
+      </w:pPr>
+      <w:r>
+        <w:t>Confusion</w:t>
+      </w:r>
+    </w:p>
+    <w:p>
+      <w:pPr>
+        <w:pStyle w:val="Paragraphedeliste"/>
+        <w:numPr>
+          <w:ilvl w:val="2"/>
+          <w:numId w:val="1"/>
+        </w:numPr>
+      </w:pPr>
+      <w:r>
+        <w:t xml:space="preserve"> Sueurs</w:t>
+      </w:r>
+    </w:p>
+    <w:p>
+      <w:pPr>
+        <w:pStyle w:val="Paragraphedeliste"/>
+        <w:numPr>
+          <w:ilvl w:val="2"/>
+          <w:numId w:val="1"/>
+        </w:numPr>
+      </w:pPr>
+      <w:r>
+        <w:t xml:space="preserve"> Comportement anormal</w:t>
+      </w:r>
+    </w:p>
+    <w:p>
+      <w:pPr>
+        <w:pStyle w:val="Paragraphedeliste"/>
+        <w:numPr>
+          <w:ilvl w:val="1"/>
+          <w:numId w:val="1"/>
+        </w:numPr>
+      </w:pPr>
+      <w:r>
+        <w:t>Embolie pulmonaire</w:t>
+      </w:r>
+    </w:p>
+    <w:p>
+      <w:pPr>
+        <w:pStyle w:val="Paragraphedeliste"/>
+        <w:numPr>
+          <w:ilvl w:val="2"/>
+          <w:numId w:val="1"/>
+        </w:numPr>
+      </w:pPr>
+      <w:r>
+        <w:t>Douleur thoracique</w:t>
+      </w:r>
+    </w:p>
+    <w:p>
+      <w:pPr>
+        <w:pStyle w:val="Paragraphedeliste"/>
+        <w:numPr>
+          <w:ilvl w:val="2"/>
+          <w:numId w:val="1"/>
+        </w:numPr>
+      </w:pPr>
+      <w:r>
+        <w:t xml:space="preserve"> Essoufflement soudain</w:t>
+      </w:r>
+    </w:p>
+    <w:p>
+      <w:pPr>
+        <w:pStyle w:val="Paragraphedeliste"/>
+        <w:numPr>
+          <w:ilvl w:val="2"/>
+          <w:numId w:val="1"/>
+        </w:numPr>
+      </w:pPr>
+      <w:r>
+        <w:t xml:space="preserve"> Tachycardie</w:t>
+      </w:r>
+    </w:p>
+    <w:p>
+      <w:pPr>
+        <w:pStyle w:val="Paragraphedeliste"/>
+        <w:numPr>
+          <w:ilvl w:val="1"/>
+          <w:numId w:val="1"/>
+        </w:numPr>
+      </w:pPr>
+      <w:r>
+        <w:t>Vo</w:t>
+      </w:r>
+      <w:r>
+        <w:t>missements de sang</w:t>
+      </w:r>
+    </w:p>
+    <w:p>
+      <w:pPr>
+        <w:pStyle w:val="Paragraphedeliste"/>
+        <w:numPr>
+          <w:ilvl w:val="1"/>
+          <w:numId w:val="1"/>
+        </w:numPr>
+      </w:pPr>
+      <w:r>
+        <w:t>État</w:t>
+      </w:r>
+      <w:r>
+        <w:t xml:space="preserve"> mental altéré</w:t>
+      </w:r>
+    </w:p>
+    <w:p>
+      <w:pPr>
+        <w:pStyle w:val="Paragraphedeliste"/>
+        <w:numPr>
+          <w:ilvl w:val="1"/>
+          <w:numId w:val="1"/>
+        </w:numPr>
+      </w:pPr>
+      <w:r>
+        <w:t>Tension</w:t>
+      </w:r>
+      <w:r>
+        <w:t xml:space="preserve"> artérielle extrêmement élevée</w:t>
+      </w:r>
+    </w:p>
+    <w:p>
+      <w:pPr>
+        <w:pStyle w:val="Paragraphedeliste"/>
+        <w:numPr>
           <w:ilvl w:val="0"/>
           <w:numId w:val="1"/>
         </w:numPr>
@@ -314,10 +744,10 @@
         </w:numPr>
       </w:pPr>
       <w:r>
-        <w:t>Fracture</w:t>
-      </w:r>
-      <w:r>
-        <w:t xml:space="preserve"> légère</w:t>
+        <w:t>Fracture légère</w:t>
+      </w:r>
+      <w:r>
+        <w:t xml:space="preserve"> (fermé)</w:t>
       </w:r>
     </w:p>
     <w:p>
@@ -353,10 +783,437 @@
         </w:numPr>
       </w:pPr>
       <w:r>
-        <w:t xml:space="preserve">Mobilité </w:t>
-      </w:r>
-      <w:r>
-        <w:t>partielle</w:t>
+        <w:t>Mobilité partielle</w:t>
+      </w:r>
+    </w:p>
+    <w:p>
+      <w:pPr>
+        <w:pStyle w:val="Paragraphedeliste"/>
+        <w:numPr>
+          <w:ilvl w:val="2"/>
+          <w:numId w:val="1"/>
+        </w:numPr>
+      </w:pPr>
+      <w:r>
+        <w:t>Gonflement modéré</w:t>
+      </w:r>
+    </w:p>
+    <w:p>
+      <w:pPr>
+        <w:pStyle w:val="Paragraphedeliste"/>
+        <w:numPr>
+          <w:ilvl w:val="1"/>
+          <w:numId w:val="1"/>
+        </w:numPr>
+      </w:pPr>
+      <w:r>
+        <w:t>Entorse importante</w:t>
+      </w:r>
+    </w:p>
+    <w:p>
+      <w:pPr>
+        <w:pStyle w:val="Paragraphedeliste"/>
+        <w:numPr>
+          <w:ilvl w:val="2"/>
+          <w:numId w:val="1"/>
+        </w:numPr>
+      </w:pPr>
+      <w:r>
+        <w:t>Douleur forte,</w:t>
+      </w:r>
+    </w:p>
+    <w:p>
+      <w:pPr>
+        <w:pStyle w:val="Paragraphedeliste"/>
+        <w:numPr>
+          <w:ilvl w:val="2"/>
+          <w:numId w:val="1"/>
+        </w:numPr>
+      </w:pPr>
+      <w:r>
+        <w:t xml:space="preserve">Gonflement </w:t>
+      </w:r>
+    </w:p>
+    <w:p>
+      <w:pPr>
+        <w:pStyle w:val="Paragraphedeliste"/>
+        <w:numPr>
+          <w:ilvl w:val="2"/>
+          <w:numId w:val="1"/>
+        </w:numPr>
+      </w:pPr>
+      <w:r>
+        <w:t>Mobilité réduite</w:t>
+      </w:r>
+    </w:p>
+    <w:p>
+      <w:pPr>
+        <w:pStyle w:val="Paragraphedeliste"/>
+        <w:numPr>
+          <w:ilvl w:val="2"/>
+          <w:numId w:val="1"/>
+        </w:numPr>
+      </w:pPr>
+      <w:r>
+        <w:t>Ecchymose</w:t>
+      </w:r>
+    </w:p>
+    <w:p>
+      <w:pPr>
+        <w:pStyle w:val="Paragraphedeliste"/>
+        <w:numPr>
+          <w:ilvl w:val="1"/>
+          <w:numId w:val="1"/>
+        </w:numPr>
+      </w:pPr>
+      <w:r>
+        <w:t>Appendicite</w:t>
+      </w:r>
+    </w:p>
+    <w:p>
+      <w:pPr>
+        <w:pStyle w:val="Paragraphedeliste"/>
+        <w:numPr>
+          <w:ilvl w:val="2"/>
+          <w:numId w:val="1"/>
+        </w:numPr>
+      </w:pPr>
+      <w:r>
+        <w:t>Douleur abdominale localisée (souvent à droite)</w:t>
+      </w:r>
+    </w:p>
+    <w:p>
+      <w:pPr>
+        <w:pStyle w:val="Paragraphedeliste"/>
+        <w:numPr>
+          <w:ilvl w:val="2"/>
+          <w:numId w:val="1"/>
+        </w:numPr>
+      </w:pPr>
+      <w:r>
+        <w:t xml:space="preserve"> Fièvre</w:t>
+      </w:r>
+    </w:p>
+    <w:p>
+      <w:pPr>
+        <w:pStyle w:val="Paragraphedeliste"/>
+        <w:numPr>
+          <w:ilvl w:val="2"/>
+          <w:numId w:val="1"/>
+        </w:numPr>
+      </w:pPr>
+      <w:r>
+        <w:t xml:space="preserve"> Nausées</w:t>
+      </w:r>
+    </w:p>
+    <w:p>
+      <w:pPr>
+        <w:pStyle w:val="Paragraphedeliste"/>
+        <w:numPr>
+          <w:ilvl w:val="1"/>
+          <w:numId w:val="1"/>
+        </w:numPr>
+      </w:pPr>
+      <w:r>
+        <w:t>Pneumonie</w:t>
+      </w:r>
+    </w:p>
+    <w:p>
+      <w:pPr>
+        <w:pStyle w:val="Paragraphedeliste"/>
+        <w:numPr>
+          <w:ilvl w:val="2"/>
+          <w:numId w:val="1"/>
+        </w:numPr>
+      </w:pPr>
+      <w:r>
+        <w:t>Toux, fièvre</w:t>
+      </w:r>
+    </w:p>
+    <w:p>
+      <w:pPr>
+        <w:pStyle w:val="Paragraphedeliste"/>
+        <w:numPr>
+          <w:ilvl w:val="2"/>
+          <w:numId w:val="1"/>
+        </w:numPr>
+      </w:pPr>
+      <w:r>
+        <w:t xml:space="preserve"> Douleur thoracique</w:t>
+      </w:r>
+    </w:p>
+    <w:p>
+      <w:pPr>
+        <w:pStyle w:val="Paragraphedeliste"/>
+        <w:numPr>
+          <w:ilvl w:val="2"/>
+          <w:numId w:val="1"/>
+        </w:numPr>
+      </w:pPr>
+      <w:r>
+        <w:t xml:space="preserve"> Essoufflement modéré</w:t>
+      </w:r>
+    </w:p>
+    <w:p>
+      <w:pPr>
+        <w:pStyle w:val="Paragraphedeliste"/>
+        <w:numPr>
+          <w:ilvl w:val="1"/>
+          <w:numId w:val="1"/>
+        </w:numPr>
+      </w:pPr>
+      <w:r>
+        <w:lastRenderedPageBreak/>
+        <w:t>Colique néphrétique</w:t>
+      </w:r>
+      <w:r>
+        <w:t xml:space="preserve"> (</w:t>
+      </w:r>
+      <w:r>
+        <w:t>grossesse ou rein unique = hospitalisation</w:t>
+      </w:r>
+      <w:r>
+        <w:t>)</w:t>
+      </w:r>
+    </w:p>
+    <w:p>
+      <w:pPr>
+        <w:pStyle w:val="Paragraphedeliste"/>
+        <w:numPr>
+          <w:ilvl w:val="2"/>
+          <w:numId w:val="1"/>
+        </w:numPr>
+      </w:pPr>
+      <w:r>
+        <w:t>Douleur lombaire intense</w:t>
+      </w:r>
+    </w:p>
+    <w:p>
+      <w:pPr>
+        <w:pStyle w:val="Paragraphedeliste"/>
+        <w:numPr>
+          <w:ilvl w:val="2"/>
+          <w:numId w:val="1"/>
+        </w:numPr>
+      </w:pPr>
+      <w:r>
+        <w:t xml:space="preserve"> Irradiation vers l’aine</w:t>
+      </w:r>
+    </w:p>
+    <w:p>
+      <w:pPr>
+        <w:pStyle w:val="Paragraphedeliste"/>
+        <w:numPr>
+          <w:ilvl w:val="2"/>
+          <w:numId w:val="1"/>
+        </w:numPr>
+      </w:pPr>
+      <w:r>
+        <w:t xml:space="preserve"> Agitation</w:t>
+      </w:r>
+    </w:p>
+    <w:p>
+      <w:pPr>
+        <w:pStyle w:val="Paragraphedeliste"/>
+        <w:numPr>
+          <w:ilvl w:val="1"/>
+          <w:numId w:val="1"/>
+        </w:numPr>
+      </w:pPr>
+      <w:r>
+        <w:t>Infection urinaire compliquée</w:t>
+      </w:r>
+    </w:p>
+    <w:p>
+      <w:pPr>
+        <w:pStyle w:val="Paragraphedeliste"/>
+        <w:numPr>
+          <w:ilvl w:val="2"/>
+          <w:numId w:val="1"/>
+        </w:numPr>
+      </w:pPr>
+      <w:r>
+        <w:t>Douleur</w:t>
+      </w:r>
+    </w:p>
+    <w:p>
+      <w:pPr>
+        <w:pStyle w:val="Paragraphedeliste"/>
+        <w:numPr>
+          <w:ilvl w:val="2"/>
+          <w:numId w:val="1"/>
+        </w:numPr>
+      </w:pPr>
+      <w:r>
+        <w:t xml:space="preserve"> Fièvre</w:t>
+      </w:r>
+    </w:p>
+    <w:p>
+      <w:pPr>
+        <w:pStyle w:val="Paragraphedeliste"/>
+        <w:numPr>
+          <w:ilvl w:val="2"/>
+          <w:numId w:val="1"/>
+        </w:numPr>
+      </w:pPr>
+      <w:r>
+        <w:t xml:space="preserve"> </w:t>
+      </w:r>
+      <w:r>
+        <w:t>Brûlures</w:t>
+      </w:r>
+      <w:r>
+        <w:t xml:space="preserve"> urinaires</w:t>
+      </w:r>
+    </w:p>
+    <w:p>
+      <w:pPr>
+        <w:pStyle w:val="Paragraphedeliste"/>
+        <w:numPr>
+          <w:ilvl w:val="1"/>
+          <w:numId w:val="1"/>
+        </w:numPr>
+      </w:pPr>
+      <w:r>
+        <w:t>A</w:t>
+      </w:r>
+      <w:r>
+        <w:t>sthme</w:t>
+      </w:r>
+    </w:p>
+    <w:p>
+      <w:pPr>
+        <w:pStyle w:val="Paragraphedeliste"/>
+        <w:numPr>
+          <w:ilvl w:val="1"/>
+          <w:numId w:val="1"/>
+        </w:numPr>
+      </w:pPr>
+      <w:r>
+        <w:t>Mal</w:t>
+      </w:r>
+      <w:r>
+        <w:t xml:space="preserve"> de tête grave</w:t>
+      </w:r>
+    </w:p>
+    <w:p>
+      <w:pPr>
+        <w:pStyle w:val="Paragraphedeliste"/>
+        <w:numPr>
+          <w:ilvl w:val="1"/>
+          <w:numId w:val="1"/>
+        </w:numPr>
+      </w:pPr>
+      <w:r>
+        <w:t>Trauma</w:t>
+      </w:r>
+      <w:r>
+        <w:t xml:space="preserve"> mineur</w:t>
+      </w:r>
+    </w:p>
+    <w:p>
+      <w:pPr>
+        <w:pStyle w:val="Paragraphedeliste"/>
+        <w:numPr>
+          <w:ilvl w:val="1"/>
+          <w:numId w:val="1"/>
+        </w:numPr>
+      </w:pPr>
+      <w:r>
+        <w:t>Tension</w:t>
+      </w:r>
+      <w:r>
+        <w:t xml:space="preserve"> artérielle élevée</w:t>
+      </w:r>
+    </w:p>
+    <w:p>
+      <w:pPr>
+        <w:pStyle w:val="Paragraphedeliste"/>
+        <w:numPr>
+          <w:ilvl w:val="1"/>
+          <w:numId w:val="1"/>
+        </w:numPr>
+      </w:pPr>
+      <w:r>
+        <w:t>E</w:t>
+      </w:r>
+      <w:r>
+        <w:t>ssoufflement</w:t>
+      </w:r>
+    </w:p>
+    <w:p>
+      <w:pPr>
+        <w:pStyle w:val="Paragraphedeliste"/>
+        <w:numPr>
+          <w:ilvl w:val="1"/>
+          <w:numId w:val="1"/>
+        </w:numPr>
+      </w:pPr>
+      <w:r>
+        <w:t>Douleur abdominale</w:t>
+      </w:r>
+    </w:p>
+    <w:p>
+      <w:pPr>
+        <w:pStyle w:val="Paragraphedeliste"/>
+        <w:numPr>
+          <w:ilvl w:val="0"/>
+          <w:numId w:val="1"/>
+        </w:numPr>
+      </w:pPr>
+      <w:r>
+        <w:t xml:space="preserve">Priorité 4 </w:t>
+      </w:r>
+    </w:p>
+    <w:p>
+      <w:pPr>
+        <w:pStyle w:val="Paragraphedeliste"/>
+        <w:numPr>
+          <w:ilvl w:val="1"/>
+          <w:numId w:val="1"/>
+        </w:numPr>
+      </w:pPr>
+      <w:r>
+        <w:t xml:space="preserve">Entorse </w:t>
+      </w:r>
+    </w:p>
+    <w:p>
+      <w:pPr>
+        <w:pStyle w:val="Paragraphedeliste"/>
+        <w:numPr>
+          <w:ilvl w:val="2"/>
+          <w:numId w:val="1"/>
+        </w:numPr>
+      </w:pPr>
+      <w:r>
+        <w:t xml:space="preserve">Douleur </w:t>
+      </w:r>
+      <w:r>
+        <w:t>légère</w:t>
+      </w:r>
+    </w:p>
+    <w:p>
+      <w:pPr>
+        <w:pStyle w:val="Paragraphedeliste"/>
+        <w:numPr>
+          <w:ilvl w:val="2"/>
+          <w:numId w:val="1"/>
+        </w:numPr>
+      </w:pPr>
+      <w:r>
+        <w:t>Ecchymose</w:t>
+      </w:r>
+    </w:p>
+    <w:p>
+      <w:pPr>
+        <w:pStyle w:val="Paragraphedeliste"/>
+        <w:numPr>
+          <w:ilvl w:val="2"/>
+          <w:numId w:val="1"/>
+        </w:numPr>
+      </w:pPr>
+      <w:r>
+        <w:t>Mobilité conservée</w:t>
       </w:r>
     </w:p>
     <w:p>
@@ -371,77 +1228,86 @@
         <w:t>Gonflement</w:t>
       </w:r>
       <w:r>
-        <w:t xml:space="preserve"> modéré</w:t>
-      </w:r>
-    </w:p>
-    <w:p>
-      <w:pPr>
-        <w:pStyle w:val="Paragraphedeliste"/>
-        <w:numPr>
-          <w:ilvl w:val="1"/>
-          <w:numId w:val="1"/>
-        </w:numPr>
-      </w:pPr>
-      <w:r>
-        <w:t>Entorse importante</w:t>
-      </w:r>
-    </w:p>
-    <w:p>
-      <w:pPr>
-        <w:pStyle w:val="Paragraphedeliste"/>
-        <w:numPr>
-          <w:ilvl w:val="2"/>
-          <w:numId w:val="1"/>
-        </w:numPr>
-      </w:pPr>
-      <w:r>
-        <w:t>Douleur forte,</w:t>
-      </w:r>
-    </w:p>
-    <w:p>
-      <w:pPr>
-        <w:pStyle w:val="Paragraphedeliste"/>
-        <w:numPr>
-          <w:ilvl w:val="2"/>
-          <w:numId w:val="1"/>
-        </w:numPr>
-      </w:pPr>
-      <w:r>
-        <w:t xml:space="preserve">Gonflement </w:t>
-      </w:r>
-    </w:p>
-    <w:p>
-      <w:pPr>
-        <w:pStyle w:val="Paragraphedeliste"/>
-        <w:numPr>
-          <w:ilvl w:val="2"/>
-          <w:numId w:val="1"/>
-        </w:numPr>
-      </w:pPr>
-      <w:r>
-        <w:t>Mobilité réduite</w:t>
-      </w:r>
-    </w:p>
-    <w:p>
-      <w:pPr>
-        <w:pStyle w:val="Paragraphedeliste"/>
-        <w:numPr>
-          <w:ilvl w:val="2"/>
-          <w:numId w:val="1"/>
-        </w:numPr>
-      </w:pPr>
-      <w:r>
-        <w:t>Ecchymose</w:t>
-      </w:r>
-    </w:p>
-    <w:p>
-      <w:pPr>
-        <w:pStyle w:val="Paragraphedeliste"/>
-        <w:numPr>
-          <w:ilvl w:val="2"/>
-          <w:numId w:val="1"/>
-        </w:numPr>
-      </w:pPr>
+        <w:t xml:space="preserve"> léger</w:t>
+      </w:r>
+    </w:p>
+    <w:p>
+      <w:pPr>
+        <w:pStyle w:val="Paragraphedeliste"/>
+        <w:numPr>
+          <w:ilvl w:val="1"/>
+          <w:numId w:val="1"/>
+        </w:numPr>
+      </w:pPr>
+      <w:r>
+        <w:t>Infection mineure</w:t>
+      </w:r>
+      <w:r>
+        <w:t xml:space="preserve"> </w:t>
+      </w:r>
+    </w:p>
+    <w:p>
+      <w:pPr>
+        <w:pStyle w:val="Paragraphedeliste"/>
+        <w:numPr>
+          <w:ilvl w:val="1"/>
+          <w:numId w:val="1"/>
+        </w:numPr>
+      </w:pPr>
+      <w:r>
+        <w:t>Coupure légère</w:t>
+      </w:r>
+    </w:p>
+    <w:p>
+      <w:pPr>
+        <w:pStyle w:val="Paragraphedeliste"/>
+        <w:numPr>
+          <w:ilvl w:val="2"/>
+          <w:numId w:val="1"/>
+        </w:numPr>
+      </w:pPr>
+      <w:r>
+        <w:t xml:space="preserve">Saignement </w:t>
+      </w:r>
+    </w:p>
+    <w:p>
+      <w:pPr>
+        <w:pStyle w:val="Paragraphedeliste"/>
+        <w:numPr>
+          <w:ilvl w:val="1"/>
+          <w:numId w:val="1"/>
+        </w:numPr>
+      </w:pPr>
+      <w:r>
+        <w:t>Maux de tête</w:t>
+      </w:r>
+    </w:p>
+    <w:p>
+      <w:pPr>
+        <w:pStyle w:val="Paragraphedeliste"/>
+        <w:numPr>
+          <w:ilvl w:val="1"/>
+          <w:numId w:val="1"/>
+        </w:numPr>
+      </w:pPr>
+      <w:r>
+        <w:t xml:space="preserve">Fièvre </w:t>
+      </w:r>
+      <w:r>
+        <w:t xml:space="preserve"> </w:t>
+      </w:r>
+    </w:p>
+    <w:p>
+      <w:pPr>
+        <w:pStyle w:val="Paragraphedeliste"/>
+        <w:numPr>
+          <w:ilvl w:val="1"/>
+          <w:numId w:val="1"/>
+        </w:numPr>
+      </w:pPr>
+      <w:r>
+        <w:t>Problèmes cutanés (éruption, infection mineure)</w:t>
+      </w:r>
     </w:p>
     <w:p>
       <w:pPr>
@@ -452,209 +1318,257 @@
         </w:numPr>
       </w:pPr>
       <w:r>
-        <w:t xml:space="preserve">Priorité 4 </w:t>
-      </w:r>
-    </w:p>
-    <w:p>
-      <w:pPr>
-        <w:pStyle w:val="Paragraphedeliste"/>
-        <w:numPr>
-          <w:ilvl w:val="1"/>
-          <w:numId w:val="1"/>
-        </w:numPr>
-      </w:pPr>
-      <w:r>
-        <w:t xml:space="preserve">Entorse </w:t>
-      </w:r>
-    </w:p>
-    <w:p>
-      <w:pPr>
-        <w:pStyle w:val="Paragraphedeliste"/>
-        <w:numPr>
-          <w:ilvl w:val="2"/>
+        <w:t>Priorité 5</w:t>
+      </w:r>
+    </w:p>
+    <w:p>
+      <w:pPr>
+        <w:pStyle w:val="Paragraphedeliste"/>
+        <w:numPr>
+          <w:ilvl w:val="1"/>
+          <w:numId w:val="1"/>
+        </w:numPr>
+      </w:pPr>
+      <w:r>
+        <w:t xml:space="preserve">Rhume </w:t>
+      </w:r>
+    </w:p>
+    <w:p>
+      <w:pPr>
+        <w:pStyle w:val="Paragraphedeliste"/>
+        <w:numPr>
+          <w:ilvl w:val="2"/>
+          <w:numId w:val="1"/>
+        </w:numPr>
+      </w:pPr>
+      <w:r>
+        <w:t xml:space="preserve">Toux </w:t>
+      </w:r>
+    </w:p>
+    <w:p>
+      <w:pPr>
+        <w:pStyle w:val="Paragraphedeliste"/>
+        <w:numPr>
+          <w:ilvl w:val="2"/>
+          <w:numId w:val="1"/>
+        </w:numPr>
+      </w:pPr>
+      <w:r>
+        <w:t xml:space="preserve">Maux de tête </w:t>
+      </w:r>
+    </w:p>
+    <w:p>
+      <w:pPr>
+        <w:pStyle w:val="Paragraphedeliste"/>
+        <w:numPr>
+          <w:ilvl w:val="2"/>
+          <w:numId w:val="1"/>
+        </w:numPr>
+      </w:pPr>
+      <w:r>
+        <w:t>Éternument</w:t>
+      </w:r>
+    </w:p>
+    <w:p>
+      <w:pPr>
+        <w:pStyle w:val="Paragraphedeliste"/>
+        <w:numPr>
+          <w:ilvl w:val="2"/>
+          <w:numId w:val="1"/>
+        </w:numPr>
+      </w:pPr>
+      <w:r>
+        <w:t>Écoulement nasal</w:t>
+      </w:r>
+    </w:p>
+    <w:p>
+      <w:pPr>
+        <w:pStyle w:val="Paragraphedeliste"/>
+        <w:numPr>
+          <w:ilvl w:val="2"/>
+          <w:numId w:val="1"/>
+        </w:numPr>
+      </w:pPr>
+      <w:r>
+        <w:t>Irritation à la gorge</w:t>
+      </w:r>
+    </w:p>
+    <w:p>
+      <w:pPr>
+        <w:pStyle w:val="Paragraphedeliste"/>
+        <w:numPr>
+          <w:ilvl w:val="2"/>
+          <w:numId w:val="1"/>
+        </w:numPr>
+      </w:pPr>
+      <w:r>
+        <w:t xml:space="preserve">Fatigue </w:t>
+      </w:r>
+    </w:p>
+    <w:p>
+      <w:pPr>
+        <w:pStyle w:val="Paragraphedeliste"/>
+        <w:numPr>
+          <w:ilvl w:val="1"/>
+          <w:numId w:val="1"/>
+        </w:numPr>
+      </w:pPr>
+      <w:r>
+        <w:t> </w:t>
+      </w:r>
+      <w:r>
+        <w:t>É</w:t>
+      </w:r>
+      <w:r>
+        <w:t>corchure</w:t>
+      </w:r>
+    </w:p>
+    <w:p>
+      <w:pPr>
+        <w:pStyle w:val="Paragraphedeliste"/>
+        <w:numPr>
+          <w:ilvl w:val="1"/>
+          <w:numId w:val="1"/>
+        </w:numPr>
+      </w:pPr>
+      <w:r>
+        <w:t>Petites irritations (yeux, peau)</w:t>
+      </w:r>
+    </w:p>
+    <w:p>
+      <w:pPr>
+        <w:pStyle w:val="Paragraphedeliste"/>
+        <w:numPr>
+          <w:ilvl w:val="1"/>
+          <w:numId w:val="1"/>
+        </w:numPr>
+      </w:pPr>
+      <w:r>
+        <w:t>Douleurs chroniques stables</w:t>
+      </w:r>
+    </w:p>
+    <w:p>
+      <w:pPr>
+        <w:pStyle w:val="Paragraphedeliste"/>
+        <w:numPr>
+          <w:ilvl w:val="1"/>
+          <w:numId w:val="1"/>
+        </w:numPr>
+      </w:pPr>
+      <w:r>
+        <w:t xml:space="preserve"> </w:t>
+      </w:r>
+      <w:r>
+        <w:t>Morsure</w:t>
+      </w:r>
+      <w:r>
+        <w:t xml:space="preserve"> mineure</w:t>
+      </w:r>
+    </w:p>
+    <w:p>
+      <w:pPr>
+        <w:pStyle w:val="Paragraphedeliste"/>
+        <w:numPr>
+          <w:ilvl w:val="1"/>
           <w:numId w:val="1"/>
         </w:numPr>
       </w:pPr>
       <w:r>
         <w:lastRenderedPageBreak/>
-        <w:t xml:space="preserve">Douleur </w:t>
-      </w:r>
-      <w:r>
-        <w:t>légère</w:t>
-      </w:r>
-    </w:p>
-    <w:p>
-      <w:pPr>
-        <w:pStyle w:val="Paragraphedeliste"/>
-        <w:numPr>
-          <w:ilvl w:val="2"/>
-          <w:numId w:val="1"/>
-        </w:numPr>
-      </w:pPr>
-      <w:r>
-        <w:t>Ecchymose</w:t>
-      </w:r>
-    </w:p>
-    <w:p>
-      <w:pPr>
-        <w:pStyle w:val="Paragraphedeliste"/>
-        <w:numPr>
-          <w:ilvl w:val="2"/>
-          <w:numId w:val="1"/>
-        </w:numPr>
-      </w:pPr>
-      <w:r>
-        <w:t>Mobilité conservée</w:t>
-      </w:r>
-    </w:p>
-    <w:p>
-      <w:pPr>
-        <w:pStyle w:val="Paragraphedeliste"/>
-        <w:numPr>
-          <w:ilvl w:val="2"/>
-          <w:numId w:val="1"/>
-        </w:numPr>
-      </w:pPr>
-      <w:r>
-        <w:t>Gonflement</w:t>
-      </w:r>
-      <w:r>
-        <w:t xml:space="preserve"> léger</w:t>
-      </w:r>
-    </w:p>
-    <w:p>
-      <w:pPr>
-        <w:pStyle w:val="Paragraphedeliste"/>
-        <w:numPr>
-          <w:ilvl w:val="1"/>
-          <w:numId w:val="1"/>
-        </w:numPr>
-      </w:pPr>
-      <w:r>
-        <w:t>Coupure légère</w:t>
-      </w:r>
-    </w:p>
-    <w:p>
-      <w:pPr>
-        <w:pStyle w:val="Paragraphedeliste"/>
-        <w:numPr>
-          <w:ilvl w:val="2"/>
-          <w:numId w:val="1"/>
-        </w:numPr>
-      </w:pPr>
-      <w:r>
-        <w:t xml:space="preserve">Saignement </w:t>
-      </w:r>
-    </w:p>
-    <w:p>
-      <w:pPr>
-        <w:pStyle w:val="Paragraphedeliste"/>
-        <w:numPr>
-          <w:ilvl w:val="0"/>
-          <w:numId w:val="1"/>
-        </w:numPr>
-      </w:pPr>
-      <w:r>
-        <w:t xml:space="preserve">Priorité </w:t>
-      </w:r>
-      <w:r>
-        <w:t>5</w:t>
-      </w:r>
-    </w:p>
-    <w:p>
-      <w:pPr>
-        <w:pStyle w:val="Paragraphedeliste"/>
-        <w:numPr>
-          <w:ilvl w:val="1"/>
-          <w:numId w:val="1"/>
-        </w:numPr>
-      </w:pPr>
-      <w:r>
-        <w:t xml:space="preserve">Rhume </w:t>
-      </w:r>
-    </w:p>
-    <w:p>
-      <w:pPr>
-        <w:pStyle w:val="Paragraphedeliste"/>
-        <w:numPr>
-          <w:ilvl w:val="2"/>
-          <w:numId w:val="1"/>
-        </w:numPr>
-      </w:pPr>
-      <w:r>
-        <w:t xml:space="preserve">Toux </w:t>
-      </w:r>
-    </w:p>
-    <w:p>
-      <w:pPr>
-        <w:pStyle w:val="Paragraphedeliste"/>
-        <w:numPr>
-          <w:ilvl w:val="2"/>
-          <w:numId w:val="1"/>
-        </w:numPr>
-      </w:pPr>
-      <w:r>
-        <w:t>Maux de tête léger</w:t>
-      </w:r>
-    </w:p>
-    <w:p>
-      <w:pPr>
-        <w:pStyle w:val="Paragraphedeliste"/>
-        <w:numPr>
-          <w:ilvl w:val="2"/>
-          <w:numId w:val="1"/>
-        </w:numPr>
-      </w:pPr>
-      <w:r>
-        <w:t>Éternument</w:t>
-      </w:r>
-    </w:p>
-    <w:p>
-      <w:pPr>
-        <w:pStyle w:val="Paragraphedeliste"/>
-        <w:numPr>
-          <w:ilvl w:val="2"/>
-          <w:numId w:val="1"/>
-        </w:numPr>
-      </w:pPr>
-      <w:r>
-        <w:t>Écoulement nasal</w:t>
-      </w:r>
-    </w:p>
-    <w:p>
-      <w:pPr>
-        <w:pStyle w:val="Paragraphedeliste"/>
-        <w:numPr>
-          <w:ilvl w:val="2"/>
-          <w:numId w:val="1"/>
-        </w:numPr>
-      </w:pPr>
-      <w:r>
-        <w:t>Irritation à la gorge</w:t>
-      </w:r>
-    </w:p>
-    <w:p>
-      <w:pPr>
-        <w:pStyle w:val="Paragraphedeliste"/>
-        <w:numPr>
-          <w:ilvl w:val="2"/>
-          <w:numId w:val="1"/>
-        </w:numPr>
-      </w:pPr>
-      <w:r>
-        <w:t xml:space="preserve">Fatigue </w:t>
-      </w:r>
-    </w:p>
-    <w:p>
-      <w:pPr>
-        <w:pStyle w:val="Paragraphedeliste"/>
-        <w:numPr>
-          <w:ilvl w:val="2"/>
-          <w:numId w:val="1"/>
-        </w:numPr>
-      </w:pPr>
-      <w:r>
-        <w:t xml:space="preserve">Fièvre </w:t>
+        <w:t xml:space="preserve"> </w:t>
+      </w:r>
+      <w:r>
+        <w:t>Changement</w:t>
+      </w:r>
+      <w:r>
+        <w:t xml:space="preserve"> de pansement</w:t>
+      </w:r>
+    </w:p>
+    <w:p>
+      <w:pPr>
+        <w:pStyle w:val="Paragraphedeliste"/>
+        <w:numPr>
+          <w:ilvl w:val="1"/>
+          <w:numId w:val="1"/>
+        </w:numPr>
+      </w:pPr>
+      <w:r>
+        <w:t xml:space="preserve"> </w:t>
+      </w:r>
+      <w:r>
+        <w:t>Infection</w:t>
+      </w:r>
+      <w:r>
+        <w:t xml:space="preserve"> de la poitrine</w:t>
+      </w:r>
+    </w:p>
+    <w:p>
+      <w:pPr>
+        <w:pStyle w:val="Paragraphedeliste"/>
+        <w:numPr>
+          <w:ilvl w:val="1"/>
+          <w:numId w:val="1"/>
+        </w:numPr>
+      </w:pPr>
+      <w:r>
+        <w:t xml:space="preserve"> </w:t>
+      </w:r>
+      <w:r>
+        <w:t>Vomissements</w:t>
+      </w:r>
+      <w:r>
+        <w:t xml:space="preserve"> sans gravité</w:t>
+      </w:r>
+    </w:p>
+    <w:p>
+      <w:pPr>
+        <w:pStyle w:val="Paragraphedeliste"/>
+        <w:numPr>
+          <w:ilvl w:val="1"/>
+          <w:numId w:val="1"/>
+        </w:numPr>
+      </w:pPr>
+      <w:r>
+        <w:t>Demandes administratives ou consultations simples</w:t>
+      </w:r>
+    </w:p>
+    <w:p>
+      <w:pPr>
+        <w:pStyle w:val="Paragraphedeliste"/>
+        <w:numPr>
+          <w:ilvl w:val="1"/>
+          <w:numId w:val="1"/>
+        </w:numPr>
+      </w:pPr>
+      <w:r>
+        <w:t xml:space="preserve"> </w:t>
+      </w:r>
+      <w:r>
+        <w:t>Diarrhée</w:t>
+      </w:r>
+    </w:p>
+    <w:p>
+      <w:pPr>
+        <w:pStyle w:val="Paragraphedeliste"/>
+        <w:numPr>
+          <w:ilvl w:val="1"/>
+          <w:numId w:val="1"/>
+        </w:numPr>
+      </w:pPr>
+      <w:r>
+        <w:t>Renouvellement d’ordonnance</w:t>
+      </w:r>
+    </w:p>
+    <w:p>
+      <w:pPr>
+        <w:pStyle w:val="Paragraphedeliste"/>
+        <w:numPr>
+          <w:ilvl w:val="1"/>
+          <w:numId w:val="1"/>
+        </w:numPr>
+      </w:pPr>
+      <w:r>
+        <w:t>Écharde</w:t>
       </w:r>
     </w:p>
     <w:p>

</xml_diff>